<commit_message>
Lisa Y-juhtimise juhend Alar Ojastu audioraamatu pohjal
- y-juhtimine-riigisektor-juhend.docx: juhtimise pohimotted riigisektoris
- Techno TLN eeskirja lisa 8: Y-juhtimine ja lugupidav juhtimine
- lisa-y-juhtimine-alar-ojastu.md: allika kokkuvote ja seosed

Co-authored-by: reneealuste-commits <reneealuste-commits@users.noreply.github.com>
</commit_message>
<xml_diff>
--- a/riigisektor/techno-tln-austus-sisekorra-eeskiri.docx
+++ b/riigisektor/techno-tln-austus-sisekorra-eeskiri.docx
@@ -2250,6 +2250,119 @@
           <w:sz w:val="22"/>
         </w:rPr>
         <w:t>Techno TLN: Kvaliteet | Kättesaadavus | Hoolivus</w:t>
+      </w:r>
+    </w:p>
+    <w:p>
+      <w:pPr>
+        <w:spacing w:before="240" w:after="120"/>
+      </w:pPr>
+      <w:r>
+        <w:rPr>
+          <w:rFonts w:ascii="Calibri" w:hAnsi="Calibri"/>
+          <w:b/>
+          <w:sz w:val="28"/>
+        </w:rPr>
+        <w:t>8. Y-juhtimine ja lugupidav juhtimine (Alar Ojastu)</w:t>
+      </w:r>
+    </w:p>
+    <w:p>
+      <w:pPr>
+        <w:spacing w:after="100"/>
+      </w:pPr>
+      <w:r>
+        <w:rPr>
+          <w:rFonts w:ascii="Calibri" w:hAnsi="Calibri"/>
+          <w:b w:val="0"/>
+          <w:i w:val="0"/>
+          <w:sz w:val="22"/>
+        </w:rPr>
+        <w:t>Allikas: Ratsionaalne emotsionaalsus, peatükk 3 - Y-juhtimine. Põhimõte riigisektoris: noor õppija ja noor töötaja vajavad vastust küsimusele MIKS, mitte ainult käsku.</w:t>
+      </w:r>
+    </w:p>
+    <w:p>
+      <w:pPr>
+        <w:pStyle w:val="ListBullet"/>
+      </w:pPr>
+      <w:r>
+        <w:rPr>
+          <w:rFonts w:ascii="Calibri" w:hAnsi="Calibri"/>
+          <w:sz w:val="22"/>
+        </w:rPr>
+        <w:t>Probleem ei ole õpilane või töötaja - vana juhtimismudel ei tööta</w:t>
+      </w:r>
+    </w:p>
+    <w:p>
+      <w:pPr>
+        <w:pStyle w:val="ListBullet"/>
+      </w:pPr>
+      <w:r>
+        <w:rPr>
+          <w:rFonts w:ascii="Calibri" w:hAnsi="Calibri"/>
+          <w:sz w:val="22"/>
+        </w:rPr>
+        <w:t>Ülemus asendub treeneriga: eesmärk, areng, vastutus koos</w:t>
+      </w:r>
+    </w:p>
+    <w:p>
+      <w:pPr>
+        <w:pStyle w:val="ListBullet"/>
+      </w:pPr>
+      <w:r>
+        <w:rPr>
+          <w:rFonts w:ascii="Calibri" w:hAnsi="Calibri"/>
+          <w:sz w:val="22"/>
+        </w:rPr>
+        <w:t>Missioon enne numbrit: miks Techno TLN on oluline, mitte ainult tulemused</w:t>
+      </w:r>
+    </w:p>
+    <w:p>
+      <w:pPr>
+        <w:pStyle w:val="ListBullet"/>
+      </w:pPr>
+      <w:r>
+        <w:rPr>
+          <w:rFonts w:ascii="Calibri" w:hAnsi="Calibri"/>
+          <w:sz w:val="22"/>
+        </w:rPr>
+        <w:t>Pidev vestlus, mitte üks arenguvestlus aastas</w:t>
+      </w:r>
+    </w:p>
+    <w:p>
+      <w:pPr>
+        <w:pStyle w:val="ListBullet"/>
+      </w:pPr>
+      <w:r>
+        <w:rPr>
+          <w:rFonts w:ascii="Calibri" w:hAnsi="Calibri"/>
+          <w:sz w:val="22"/>
+        </w:rPr>
+        <w:t>Juht on aus - sõnad ja teod peavad klappima (maski kandmine õpetab teisi valetama)</w:t>
+      </w:r>
+    </w:p>
+    <w:p>
+      <w:pPr>
+        <w:pStyle w:val="ListBullet"/>
+      </w:pPr>
+      <w:r>
+        <w:rPr>
+          <w:rFonts w:ascii="Calibri" w:hAnsi="Calibri"/>
+          <w:sz w:val="22"/>
+        </w:rPr>
+        <w:t>Hoolivus on ratsionaalne: turvaline keskkond -&gt; pühendumus -&gt; tulemus</w:t>
+      </w:r>
+    </w:p>
+    <w:p>
+      <w:pPr>
+        <w:spacing w:after="100"/>
+      </w:pPr>
+      <w:r>
+        <w:rPr>
+          <w:rFonts w:ascii="Calibri" w:hAnsi="Calibri"/>
+          <w:b w:val="0"/>
+          <w:i/>
+          <w:sz w:val="22"/>
+        </w:rPr>
+        <w:t>Vt täielik juhend: y-juhtimine-riigisektor-juhend.docx</w:t>
       </w:r>
     </w:p>
     <w:p>

</xml_diff>